<commit_message>
Grupo VIP: Casos do dia #1 a #10 novos agendados no SendFlow
As 20 ações antigas (caso01 a caso10, 12h e 19h30) foram canceladas e
recriadas nos mesmos horários com os casos novos. A resposta das 19h30
vai como imagem da página do Guia com a legenda (o #1 vai só em texto).
Atualiza as seções dos casos, os IDs e o calendário no roteiro, e o
arquivo de validação da Dra. com o que as páginas confirmaram.

Co-Authored-By: Claude Opus 5.5 <noreply@anthropic.com>
Claude-Session: https://claude.ai/code/session_012pmajsy7DujP12Ayd3CLx2
</commit_message>
<xml_diff>
--- a/CASOS-DO-DIA-VALIDACAO.docx
+++ b/CASOS-DO-DIA-VALIDACAO.docx
@@ -2021,7 +2021,7 @@
                 <w:sz w:val="21"/>
                 <w:szCs w:val="21"/>
               </w:rPr>
-              <w:t xml:space="preserve">O suporte completo na parvovirose: fluidoterapia de reposição, antieméticos indicados e o protocolo para tutores de baixa renda.</w:t>
+              <w:t xml:space="preserve">O suporte completo na parvovirose, com a fluidoterapia de reposição, os antieméticos indicados e o protocolo para tutores de baixa renda.</w:t>
             </w:r>
           </w:p>
         </w:tc>
@@ -2156,75 +2156,6 @@
                 <w:szCs w:val="21"/>
               </w:rPr>
               <w:t xml:space="preserve">Página 78, no item "Controle de náuseas e vômitos".</w:t>
-            </w:r>
-          </w:p>
-        </w:tc>
-      </w:tr>
-      <w:tr>
-        <w:trPr>
-          <w:cantSplit/>
-        </w:trPr>
-        <w:tc>
-          <w:tcPr>
-            <w:tcW w:type="dxa" w:w="2200"/>
-            <w:tcBorders>
-              <w:top w:val="single" w:color="D9B3CC" w:sz="4"/>
-              <w:left w:val="single" w:color="D9B3CC" w:sz="4"/>
-              <w:bottom w:val="single" w:color="D9B3CC" w:sz="4"/>
-              <w:right w:val="single" w:color="D9B3CC" w:sz="4"/>
-            </w:tcBorders>
-            <w:shd w:fill="F7E6F0" w:color="auto" w:val="clear"/>
-            <w:tcMar>
-              <w:top w:type="dxa" w:w="90"/>
-              <w:left w:type="dxa" w:w="130"/>
-              <w:bottom w:type="dxa" w:w="90"/>
-              <w:right w:type="dxa" w:w="130"/>
-            </w:tcMar>
-          </w:tcPr>
-          <w:p>
-            <w:pPr>
-              <w:spacing w:after="100"/>
-            </w:pPr>
-            <w:r>
-              <w:rPr>
-                <w:b/>
-                <w:bCs/>
-                <w:color w:val="3D0631"/>
-                <w:sz w:val="21"/>
-                <w:szCs w:val="21"/>
-              </w:rPr>
-              <w:t xml:space="preserve">⚠ Conferir com atenção</w:t>
-            </w:r>
-          </w:p>
-        </w:tc>
-        <w:tc>
-          <w:tcPr>
-            <w:tcW w:type="dxa" w:w="7438"/>
-            <w:tcBorders>
-              <w:top w:val="single" w:color="D9B3CC" w:sz="4"/>
-              <w:left w:val="single" w:color="D9B3CC" w:sz="4"/>
-              <w:bottom w:val="single" w:color="D9B3CC" w:sz="4"/>
-              <w:right w:val="single" w:color="D9B3CC" w:sz="4"/>
-            </w:tcBorders>
-            <w:shd w:fill="FFF4E5" w:color="auto" w:val="clear"/>
-            <w:tcMar>
-              <w:top w:type="dxa" w:w="90"/>
-              <w:left w:type="dxa" w:w="130"/>
-              <w:bottom w:type="dxa" w:w="90"/>
-              <w:right w:type="dxa" w:w="130"/>
-            </w:tcMar>
-          </w:tcPr>
-          <w:p>
-            <w:pPr>
-              <w:spacing w:after="100"/>
-            </w:pPr>
-            <w:r>
-              <w:rPr>
-                <w:color w:val="A64B00"/>
-                <w:sz w:val="21"/>
-                <w:szCs w:val="21"/>
-              </w:rPr>
-              <w:t xml:space="preserve">Muita gente usa metoclopramida em infusão na parvovirose. Confirmar se o Guia recomenda mesmo evitar.</w:t>
             </w:r>
           </w:p>
         </w:tc>
@@ -2700,7 +2631,7 @@
                 <w:sz w:val="21"/>
                 <w:szCs w:val="21"/>
               </w:rPr>
-              <w:t xml:space="preserve">A resposta é a C. Gabapentina oral antes da consulta. No gato, ela reduz a ansiedade e a agressividade sem depressão cardiorrespiratória importante, e o exame fica seguro e sem estresse. A trazodona entra principalmente na tranquilização oral dos cães.</w:t>
+              <w:t xml:space="preserve">A resposta é a C. Gabapentina oral, duas horas antes do atendimento. É a tranquilização oral para o gato ansioso ou agressivo; a trazodona é a opção para os cães. Com o gato mais tranquilo, o exame fica mais completo e seguro para todos: paciente, tutor e equipe.</w:t>
             </w:r>
           </w:p>
         </w:tc>
@@ -2902,75 +2833,6 @@
                 <w:szCs w:val="21"/>
               </w:rPr>
               <w:t xml:space="preserve">Página 12, no tópico de tranquilização oral para cães e gatos.</w:t>
-            </w:r>
-          </w:p>
-        </w:tc>
-      </w:tr>
-      <w:tr>
-        <w:trPr>
-          <w:cantSplit/>
-        </w:trPr>
-        <w:tc>
-          <w:tcPr>
-            <w:tcW w:type="dxa" w:w="2200"/>
-            <w:tcBorders>
-              <w:top w:val="single" w:color="D9B3CC" w:sz="4"/>
-              <w:left w:val="single" w:color="D9B3CC" w:sz="4"/>
-              <w:bottom w:val="single" w:color="D9B3CC" w:sz="4"/>
-              <w:right w:val="single" w:color="D9B3CC" w:sz="4"/>
-            </w:tcBorders>
-            <w:shd w:fill="F7E6F0" w:color="auto" w:val="clear"/>
-            <w:tcMar>
-              <w:top w:type="dxa" w:w="90"/>
-              <w:left w:type="dxa" w:w="130"/>
-              <w:bottom w:type="dxa" w:w="90"/>
-              <w:right w:type="dxa" w:w="130"/>
-            </w:tcMar>
-          </w:tcPr>
-          <w:p>
-            <w:pPr>
-              <w:spacing w:after="100"/>
-            </w:pPr>
-            <w:r>
-              <w:rPr>
-                <w:b/>
-                <w:bCs/>
-                <w:color w:val="3D0631"/>
-                <w:sz w:val="21"/>
-                <w:szCs w:val="21"/>
-              </w:rPr>
-              <w:t xml:space="preserve">⚠ Conferir com atenção</w:t>
-            </w:r>
-          </w:p>
-        </w:tc>
-        <w:tc>
-          <w:tcPr>
-            <w:tcW w:type="dxa" w:w="7438"/>
-            <w:tcBorders>
-              <w:top w:val="single" w:color="D9B3CC" w:sz="4"/>
-              <w:left w:val="single" w:color="D9B3CC" w:sz="4"/>
-              <w:bottom w:val="single" w:color="D9B3CC" w:sz="4"/>
-              <w:right w:val="single" w:color="D9B3CC" w:sz="4"/>
-            </w:tcBorders>
-            <w:shd w:fill="FFF4E5" w:color="auto" w:val="clear"/>
-            <w:tcMar>
-              <w:top w:type="dxa" w:w="90"/>
-              <w:left w:type="dxa" w:w="130"/>
-              <w:bottom w:type="dxa" w:w="90"/>
-              <w:right w:type="dxa" w:w="130"/>
-            </w:tcMar>
-          </w:tcPr>
-          <w:p>
-            <w:pPr>
-              <w:spacing w:after="100"/>
-            </w:pPr>
-            <w:r>
-              <w:rPr>
-                <w:color w:val="A64B00"/>
-                <w:sz w:val="21"/>
-                <w:szCs w:val="21"/>
-              </w:rPr>
-              <w:t xml:space="preserve">A trazodona também é usada em gatos. Confirmar se o Guia coloca a gabapentina como a escolha para o felino, para a trazodona não ficar como "errada" de forma injusta.</w:t>
             </w:r>
           </w:p>
         </w:tc>
@@ -4326,7 +4188,7 @@
                 <w:sz w:val="21"/>
                 <w:szCs w:val="21"/>
               </w:rPr>
-              <w:t xml:space="preserve">Volume 3 · Capítulo Doenças Infectocontagiosas · "Leishmaniose" · p. 70</w:t>
+              <w:t xml:space="preserve">Volume 3 · Capítulo Doenças Infectocontagiosas · "Leishmaniose" · p. 72 e 73</w:t>
             </w:r>
           </w:p>
         </w:tc>
@@ -4394,75 +4256,6 @@
                 <w:szCs w:val="21"/>
               </w:rPr>
               <w:t xml:space="preserve">Páginas 72 e 73, com a tabela de estadiamento e condutas do BrasilLeish 2025.</w:t>
-            </w:r>
-          </w:p>
-        </w:tc>
-      </w:tr>
-      <w:tr>
-        <w:trPr>
-          <w:cantSplit/>
-        </w:trPr>
-        <w:tc>
-          <w:tcPr>
-            <w:tcW w:type="dxa" w:w="2200"/>
-            <w:tcBorders>
-              <w:top w:val="single" w:color="D9B3CC" w:sz="4"/>
-              <w:left w:val="single" w:color="D9B3CC" w:sz="4"/>
-              <w:bottom w:val="single" w:color="D9B3CC" w:sz="4"/>
-              <w:right w:val="single" w:color="D9B3CC" w:sz="4"/>
-            </w:tcBorders>
-            <w:shd w:fill="F7E6F0" w:color="auto" w:val="clear"/>
-            <w:tcMar>
-              <w:top w:type="dxa" w:w="90"/>
-              <w:left w:type="dxa" w:w="130"/>
-              <w:bottom w:type="dxa" w:w="90"/>
-              <w:right w:type="dxa" w:w="130"/>
-            </w:tcMar>
-          </w:tcPr>
-          <w:p>
-            <w:pPr>
-              <w:spacing w:after="100"/>
-            </w:pPr>
-            <w:r>
-              <w:rPr>
-                <w:b/>
-                <w:bCs/>
-                <w:color w:val="3D0631"/>
-                <w:sz w:val="21"/>
-                <w:szCs w:val="21"/>
-              </w:rPr>
-              <w:t xml:space="preserve">⚠ Conferir com atenção</w:t>
-            </w:r>
-          </w:p>
-        </w:tc>
-        <w:tc>
-          <w:tcPr>
-            <w:tcW w:type="dxa" w:w="7438"/>
-            <w:tcBorders>
-              <w:top w:val="single" w:color="D9B3CC" w:sz="4"/>
-              <w:left w:val="single" w:color="D9B3CC" w:sz="4"/>
-              <w:bottom w:val="single" w:color="D9B3CC" w:sz="4"/>
-              <w:right w:val="single" w:color="D9B3CC" w:sz="4"/>
-            </w:tcBorders>
-            <w:shd w:fill="FFF4E5" w:color="auto" w:val="clear"/>
-            <w:tcMar>
-              <w:top w:type="dxa" w:w="90"/>
-              <w:left w:type="dxa" w:w="130"/>
-              <w:bottom w:type="dxa" w:w="90"/>
-              <w:right w:type="dxa" w:w="130"/>
-            </w:tcMar>
-          </w:tcPr>
-          <w:p>
-            <w:pPr>
-              <w:spacing w:after="100"/>
-            </w:pPr>
-            <w:r>
-              <w:rPr>
-                <w:color w:val="A64B00"/>
-                <w:sz w:val="21"/>
-                <w:szCs w:val="21"/>
-              </w:rPr>
-              <w:t xml:space="preserve">Conferir o estágio do caso (a versão original dizia "estágio III, doença leve"). Tiramos a frase "um cão tratado não representa risco à saúde pública", que não é verdade.</w:t>
             </w:r>
           </w:p>
         </w:tc>
@@ -6494,75 +6287,6 @@
                 <w:szCs w:val="21"/>
               </w:rPr>
               <w:t xml:space="preserve">Página 59, no tópico "Protocolo de introdução do tratamento".</w:t>
-            </w:r>
-          </w:p>
-        </w:tc>
-      </w:tr>
-      <w:tr>
-        <w:trPr>
-          <w:cantSplit/>
-        </w:trPr>
-        <w:tc>
-          <w:tcPr>
-            <w:tcW w:type="dxa" w:w="2200"/>
-            <w:tcBorders>
-              <w:top w:val="single" w:color="D9B3CC" w:sz="4"/>
-              <w:left w:val="single" w:color="D9B3CC" w:sz="4"/>
-              <w:bottom w:val="single" w:color="D9B3CC" w:sz="4"/>
-              <w:right w:val="single" w:color="D9B3CC" w:sz="4"/>
-            </w:tcBorders>
-            <w:shd w:fill="F7E6F0" w:color="auto" w:val="clear"/>
-            <w:tcMar>
-              <w:top w:type="dxa" w:w="90"/>
-              <w:left w:type="dxa" w:w="130"/>
-              <w:bottom w:type="dxa" w:w="90"/>
-              <w:right w:type="dxa" w:w="130"/>
-            </w:tcMar>
-          </w:tcPr>
-          <w:p>
-            <w:pPr>
-              <w:spacing w:after="100"/>
-            </w:pPr>
-            <w:r>
-              <w:rPr>
-                <w:b/>
-                <w:bCs/>
-                <w:color w:val="3D0631"/>
-                <w:sz w:val="21"/>
-                <w:szCs w:val="21"/>
-              </w:rPr>
-              <w:t xml:space="preserve">⚠ Conferir com atenção</w:t>
-            </w:r>
-          </w:p>
-        </w:tc>
-        <w:tc>
-          <w:tcPr>
-            <w:tcW w:type="dxa" w:w="7438"/>
-            <w:tcBorders>
-              <w:top w:val="single" w:color="D9B3CC" w:sz="4"/>
-              <w:left w:val="single" w:color="D9B3CC" w:sz="4"/>
-              <w:bottom w:val="single" w:color="D9B3CC" w:sz="4"/>
-              <w:right w:val="single" w:color="D9B3CC" w:sz="4"/>
-            </w:tcBorders>
-            <w:shd w:fill="FFF4E5" w:color="auto" w:val="clear"/>
-            <w:tcMar>
-              <w:top w:type="dxa" w:w="90"/>
-              <w:left w:type="dxa" w:w="130"/>
-              <w:bottom w:type="dxa" w:w="90"/>
-              <w:right w:type="dxa" w:w="130"/>
-            </w:tcMar>
-          </w:tcPr>
-          <w:p>
-            <w:pPr>
-              <w:spacing w:after="100"/>
-            </w:pPr>
-            <w:r>
-              <w:rPr>
-                <w:color w:val="A64B00"/>
-                <w:sz w:val="21"/>
-                <w:szCs w:val="21"/>
-              </w:rPr>
-              <w:t xml:space="preserve">Na literatura, a introdução gradual costuma ficar para cardiopatas e idosos; no paciente sem comorbidade muitos começam com a dose total. Confirmar se o Guia indica a introdução gradual para todos.</w:t>
             </w:r>
           </w:p>
         </w:tc>

</xml_diff>